<commit_message>
Build original and targeted resume files
</commit_message>
<xml_diff>
--- a/Sunil_Kumar_Senior_Digital_AI_Engineer.docx
+++ b/Sunil_Kumar_Senior_Digital_AI_Engineer.docx
@@ -54,7 +54,7 @@
     </w:p>
     <w:p>
       <w:r>
-        <w:t>Digital engineering and AI-focused professional with 8+ years of combined experience across Microsoft cloud services, technical problem-solving, data science, and machine learning. Hands-on with Python application prototypes, LLM integrations, document extraction, retrieval-augmented generation (RAG), vector search, API troubleshooting, and cloud-based AI services. Combines customer-facing Microsoft technical experience with independently built AI document intelligence prototypes.</w:t>
+        <w:t>Digital engineer with 8+ years across Microsoft cloud services, data science, and computer vision. Builds Python AI prototypes using LLMs, document extraction, RAG, and vector search; experienced in API/network troubleshooting and partner technical delivery.</w:t>
       </w:r>
     </w:p>
     <w:p>
@@ -78,7 +78,7 @@
         <w:ind w:left="259" w:hanging="173"/>
       </w:pPr>
       <w:r>
-        <w:t>AI application engineering: Python, Flask, Streamlit, REST APIs, JSON data contracts, document processing, application troubleshooting</w:t>
+        <w:t>AI application engineering: Python, Flask, Streamlit, REST APIs, JSON, document processing</w:t>
       </w:r>
     </w:p>
     <w:p>
@@ -88,7 +88,7 @@
         <w:ind w:left="259" w:hanging="173"/>
       </w:pPr>
       <w:r>
-        <w:t>Generative AI &amp; retrieval: LLM prompting, RAG, LangChain, ChromaDB, Google Gemini, Ollama, Qwen 2.5, human-in-the-loop review</w:t>
+        <w:t>Generative AI &amp; retrieval: LLM prompting, RAG, LangChain, ChromaDB, Gemini, Ollama, Qwen 2.5</w:t>
       </w:r>
     </w:p>
     <w:p>
@@ -98,7 +98,7 @@
         <w:ind w:left="259" w:hanging="173"/>
       </w:pPr>
       <w:r>
-        <w:t>Cloud &amp; technical delivery: Azure Cognitive Services, Azure OpenAI, Microsoft Marketplace partner workflows, API debugging, Postman, networking, VNet integration, incident management</w:t>
+        <w:t>Cloud &amp; technical delivery: Azure Cognitive Services, Azure OpenAI, Marketplace, API debugging, Postman, networking, VNet, incident management</w:t>
       </w:r>
     </w:p>
     <w:p>
@@ -108,7 +108,7 @@
         <w:ind w:left="259" w:hanging="173"/>
       </w:pPr>
       <w:r>
-        <w:t>Data science &amp; ML: pandas, NumPy, scikit-learn, EDA, statistical analysis, classification, clustering, time-series forecasting</w:t>
+        <w:t>Data science &amp; ML: pandas, NumPy, scikit-learn, EDA, classification, clustering, time-series forecasting</w:t>
       </w:r>
     </w:p>
     <w:p>
@@ -118,7 +118,7 @@
         <w:ind w:left="259" w:hanging="173"/>
       </w:pPr>
       <w:r>
-        <w:t>Data &amp; reporting: SQLite, SQL, Power BI, Tableau, Excel, data quality, dashboards</w:t>
+        <w:t>Data &amp; reporting: SQLite, SQL, Power BI, Tableau, Excel, data quality</w:t>
       </w:r>
     </w:p>
     <w:p>
@@ -161,7 +161,7 @@
         <w:ind w:left="259" w:hanging="173"/>
       </w:pPr>
       <w:r>
-        <w:t>Support Microsoft Marketplace partners with technical and operational questions across offer setup, submission, validation, and publishing workflows.</w:t>
+        <w:t>Support Microsoft Marketplace partners with offer setup, submission, validation, and publishing questions.</w:t>
       </w:r>
     </w:p>
     <w:p>
@@ -171,7 +171,7 @@
         <w:ind w:left="259" w:hanging="173"/>
       </w:pPr>
       <w:r>
-        <w:t>Reproduce and triage partner-reported issues, gather relevant diagnostics, explain technical next steps, and coordinate complex cases with internal teams.</w:t>
+        <w:t>Reproduce and triage partner issues, gather diagnostics, explain next steps, and coordinate complex cases with internal teams.</w:t>
       </w:r>
     </w:p>
     <w:p>
@@ -181,7 +181,7 @@
         <w:ind w:left="259" w:hanging="173"/>
       </w:pPr>
       <w:r>
-        <w:t>Track cases through resolution and capture recurring issue patterns and troubleshooting guidance to improve partner outcomes.</w:t>
+        <w:t>Track cases through resolution and document recurring issues and troubleshooting guidance.</w:t>
       </w:r>
     </w:p>
     <w:p>
@@ -210,7 +210,7 @@
         <w:ind w:left="259" w:hanging="173"/>
       </w:pPr>
       <w:r>
-        <w:t>Troubleshot customer and partner integrations across Azure Cognitive Services, including Speech, Language, Vision, Decision, and Azure OpenAI-related scenarios.</w:t>
+        <w:t>Troubleshot customer and partner integrations across Azure Cognitive Services, including Speech, Language, Vision, Decision, and Azure OpenAI scenarios.</w:t>
       </w:r>
     </w:p>
     <w:p>
@@ -220,7 +220,7 @@
         <w:ind w:left="259" w:hanging="173"/>
       </w:pPr>
       <w:r>
-        <w:t>Investigated API behavior, service configuration, dependencies, networking, and VNet connectivity; drove incident and case resolution with technical stakeholders.</w:t>
+        <w:t>Investigated APIs, configuration, dependencies, networking, and VNet connectivity; drove incident and case resolution.</w:t>
       </w:r>
     </w:p>
     <w:p>
@@ -230,7 +230,7 @@
         <w:ind w:left="259" w:hanging="173"/>
       </w:pPr>
       <w:r>
-        <w:t>Produced reusable technical troubleshooting guidance. Earned 8 monthly/quarterly awards, maintained a 4.97+/5 average customer rating, and advanced internally to Tier 2 support.</w:t>
+        <w:t>Created troubleshooting guidance; earned 8 monthly/quarterly awards, maintained a 4.97+/5 customer rating, and advanced to Tier 2.</w:t>
       </w:r>
     </w:p>
     <w:p>
@@ -259,7 +259,7 @@
         <w:ind w:left="259" w:hanging="173"/>
       </w:pPr>
       <w:r>
-        <w:t>Queried and analyzed Mashreq Bank personal-loan journey data with SQL and Power BI, investigating funnel drop-offs, data quality, and conversion patterns.</w:t>
+        <w:t>Analyzed Mashreq Bank personal-loan journey data with SQL and Power BI to find funnel drop-offs, data issues, and conversion patterns.</w:t>
       </w:r>
     </w:p>
     <w:p>
@@ -269,7 +269,7 @@
         <w:ind w:left="259" w:hanging="173"/>
       </w:pPr>
       <w:r>
-        <w:t>Developed and evaluated logistic- and linear-regression prototypes to estimate customer conversion likelihood and support segmentation decisions.</w:t>
+        <w:t>Developed and evaluated logistic- and linear-regression prototypes for conversion likelihood and customer segmentation.</w:t>
       </w:r>
     </w:p>
     <w:p>
@@ -310,7 +310,7 @@
         <w:ind w:left="259" w:hanging="173"/>
       </w:pPr>
       <w:r>
-        <w:t>Contributed to a self-driving vehicle computer-vision program through LiDAR and image annotation, data quality audits, human evaluation, and onboarding/training of new team members.</w:t>
+        <w:t>Contributed to a self-driving vehicle computer-vision program through LiDAR/image annotation, data quality audits, human evaluation, and team training.</w:t>
       </w:r>
     </w:p>
     <w:p>
@@ -320,7 +320,7 @@
         <w:ind w:left="259" w:hanging="173"/>
       </w:pPr>
       <w:r>
-        <w:t>Supported trust-and-safety analytics and ML workflows through data collection, cleansing, exploratory analysis, feature selection, classification, clustering, and model evaluation.</w:t>
+        <w:t>Supported trust-and-safety analytics and ML workflows: data preparation, EDA, feature selection, classification, clustering, and model evaluation.</w:t>
       </w:r>
     </w:p>
     <w:p>
@@ -330,7 +330,7 @@
         <w:ind w:left="259" w:hanging="173"/>
       </w:pPr>
       <w:r>
-        <w:t>Contributed to commodity-hedging analysis using time-series and machine-learning approaches, including ARIMA-family models, Prophet, XGBoost, and Random Forest; communicated findings through Power BI.</w:t>
+        <w:t>Contributed to commodity-hedging analysis using ARIMA-family models, Prophet, XGBoost, and Random Forest; shared findings through Power BI.</w:t>
       </w:r>
     </w:p>
     <w:p>
@@ -364,7 +364,7 @@
         <w:spacing w:after="60"/>
       </w:pPr>
       <w:r>
-        <w:t>Engineered a Python/Streamlit invoice-document prototype: accepts a PDF, extracts selectable text with pypdf, sends it to a locally served Qwen 2.5 model through Ollama, and presents structured JSON invoice fields with missing or unclear information highlighted for human review. This is an AI-assisted prototype, not an autonomous approval or accounting control. Stack: Python, Streamlit, pypdf, REST/JSON, Ollama, Qwen 2.5. Repository: https://github.com/Sunil-kumar01/automated-vendor-invoice-compliance-verification-system</w:t>
+        <w:t>Built a Python/Streamlit prototype that extracts invoice PDF text with pypdf, calls local Qwen 2.5 via Ollama, and returns structured invoice fields with missing or unclear values for human review; it does not autonomously approve invoices. Stack: Python, Streamlit, pypdf, REST/JSON, Ollama, Qwen 2.5. Repository: https://github.com/Sunil-kumar01/automated-vendor-invoice-compliance-verification-system</w:t>
       </w:r>
     </w:p>
     <w:p>
@@ -384,7 +384,7 @@
         <w:spacing w:after="60"/>
       </w:pPr>
       <w:r>
-        <w:t>Built a Flask document Q&amp;A prototype with PDF, Word, and PowerPoint ingestion, document text processing, retrieval-augmented question answering, and user/admin document-management flows. Used vector retrieval to ground responses in uploaded document content and an LLM integration for answer generation. Stack: Python, Flask, LangChain, ChromaDB, SQLite, Google Gemini. Repository: https://github.com/Sunil-kumar01/Document_search_poc</w:t>
+        <w:t>Built Flask document Q&amp;A for PDF, Word, and PowerPoint uploads, using LangChain and ChromaDB retrieval with Gemini answer generation; includes user/admin document-management flows. Stack: Python, Flask, LangChain, ChromaDB, SQLite, Google Gemini. Repository: https://github.com/Sunil-kumar01/Document_search_poc</w:t>
       </w:r>
     </w:p>
     <w:p>
@@ -418,17 +418,7 @@
         <w:ind w:left="259" w:hanging="173"/>
       </w:pPr>
       <w:r>
-        <w:t>Data Science programs — Simplilearn; Full Stack Data Scientist program — AlmaBetter</w:t>
-      </w:r>
-    </w:p>
-    <w:p>
-      <w:pPr>
-        <w:pStyle w:val="ListBullet"/>
-        <w:spacing w:after="20"/>
-        <w:ind w:left="259" w:hanging="173"/>
-      </w:pPr>
-      <w:r>
-        <w:t>Generative AI with Large Language Models — Coursera; MLOps basics using AWS/Vertex AI; Data Science Basics — Programming Hub</w:t>
+        <w:t>Additional training: Data Science (Simplilearn, AlmaBetter); Generative AI (Coursera); MLOps (AWS/Vertex AI); Data Science Basics (Programming Hub).</w:t>
       </w:r>
     </w:p>
     <w:sectPr>

</xml_diff>